<commit_message>
refocus training and inference resumes
</commit_message>
<xml_diff>
--- a/doc/冯浩然_AIInfra中文简历_推理优化版.docx
+++ b/doc/冯浩然_AIInfra中文简历_推理优化版.docx
@@ -563,7 +563,7 @@
                 <w:sz w:val="16"/>
                 <w:u w:val="none"/>
               </w:rPr>
-              <w:t>300B 级 MoE 基座模型推理与 Rollout 优化：</w:t>
+              <w:t>300B 级 MoE 基座模型推理内核与 Runtime 优化：</w:t>
             </w:r>
             <w:r>
               <w:rPr>
@@ -572,7 +572,7 @@
                 <w:sz w:val="16"/>
                 <w:u w:val="none"/>
               </w:rPr>
-              <w:t>参与内部300B级MoE基座模型推理、RL rollout与训练基础设施开发，重点解决CUDA Graph确定性、Router GEMM选核、异步状态管理、量化Runtime与多卡稳定性问题。</w:t>
+              <w:t>面向内部300B级MoE基座模型的serving与RL rollout执行链路，负责从shape感知选核、CUDA Graph确定性到跨step状态管理和Tensor Parallel验证的推理侧优化。</w:t>
             </w:r>
           </w:p>
           <w:p>
@@ -597,7 +597,7 @@
                 <w:sz w:val="16"/>
                 <w:u w:val="none"/>
               </w:rPr>
-              <w:t>推理算子优化（重点）</w:t>
+              <w:t>推理算子与执行路径优化（主体）</w:t>
             </w:r>
           </w:p>
           <w:p>
@@ -631,7 +631,7 @@
                 <w:sz w:val="16"/>
                 <w:u w:val="none"/>
               </w:rPr>
-              <w:t>在vLLM接入DeepGEMM/Triton Full-K/persistent三级后端，完成selector、capture前preflight、cache/fallback、workspace与路径回归，replay固化后端。48层Router GEMM中位耗时下降73.39%，135/135 kernel、20/20模型场景逐位一致，prefix-cache hit下TP1/TP2整请求性能提升3.81%/4.36%。</w:t>
+              <w:t>针对batch-invariant decode小M下persistent tile无效计算和Graph replay不能动态选核的约束，在vLLM工程化接入DeepGEMM/Triton Full-K/persistent三级后端；负责tensor-signature selector、capture前数值/Graph preflight、cache/fallback、workspace生命周期与路径回归，replay中固化后端决策。48层Router GEMM中位耗时下降73.39%，135/135 kernel、20/20模型场景逐位一致；prefix-cache hit下TP1/TP2整请求性能提升3.81%/4.36%。</w:t>
             </w:r>
           </w:p>
           <w:p>
@@ -656,7 +656,7 @@
                 <w:sz w:val="16"/>
                 <w:u w:val="none"/>
               </w:rPr>
-              <w:t>OE 异步状态算子：</w:t>
+              <w:t>OE 异步状态算子与多卡安全路径：</w:t>
             </w:r>
             <w:r>
               <w:rPr>
@@ -665,7 +665,41 @@
                 <w:sz w:val="16"/>
                 <w:u w:val="none"/>
               </w:rPr>
-              <w:t>将recent-token history与oe_input_ids构造保留在GPU，以Triton fused-hash消除同步与回传，并修复prefill/decode/mixed batch/恢复/slot reuse/reorder的跨step状态；TP1 28/28 case通过、吞吐较sync +4.99%，TP2/TP4均84/84、0 mismatch，decode吞吐+4.6%/+3.0%。</w:t>
+              <w:t>将recent-token history和oe_input_ids构造留在GPU，以Triton fused-hash移除TP1的GPU同步与H→D回传bubble；同时覆盖prefill/decode/mixed batch/恢复/slot reuse/reorder的跨step状态语义。TP1严格28/28 case通过、吞吐较sync +4.99%；TP&gt;1采用async-unfused + batch-invariant安全路径后，TP2/TP4均84/84、0 mismatch，decode吞吐+4.6%/+3.0%。</w:t>
+            </w:r>
+          </w:p>
+          <w:p>
+            <w:pPr>
+              <w:keepLines w:val="0"/>
+              <w:spacing w:before="0" w:after="110" w:line="264" w:lineRule="auto"/>
+              <w:ind w:left="260" w:hanging="220"/>
+            </w:pPr>
+            <w:r>
+              <w:rPr>
+                <w:rFonts w:ascii="Times New Roman" w:hAnsi="Times New Roman" w:eastAsia="宋体"/>
+                <w:b w:val="0"/>
+                <w:sz w:val="16"/>
+                <w:u w:val="none"/>
+              </w:rPr>
+              <w:t xml:space="preserve">3. </w:t>
+            </w:r>
+            <w:r>
+              <w:rPr>
+                <w:rFonts w:ascii="Times New Roman" w:hAnsi="Times New Roman" w:eastAsia="宋体"/>
+                <w:b/>
+                <w:sz w:val="16"/>
+                <w:u w:val="none"/>
+              </w:rPr>
+              <w:t>CUDA Graph Rollout hang 的 Kernel 级排障：</w:t>
+            </w:r>
+            <w:r>
+              <w:rPr>
+                <w:rFonts w:ascii="Times New Roman" w:hAnsi="Times New Roman" w:eastAsia="宋体"/>
+                <w:b w:val="0"/>
+                <w:sz w:val="16"/>
+                <w:u w:val="none"/>
+              </w:rPr>
+              <w:t>针对H200、vLLM TP=2 FULL CUDA Graph下rollout卡死，构建两卡最小复现并以TP/Graph/fused控制变量定位fused AllReduce + RMSNorm中Lamport -0.0 sentinel的FTZ误判；采用0x80000000位级判断后，模型级Graph on/off反复回归未再出现hang或timeout。</w:t>
             </w:r>
           </w:p>
           <w:p>
@@ -690,7 +724,7 @@
                 <w:sz w:val="16"/>
                 <w:u w:val="none"/>
               </w:rPr>
-              <w:t>RL 训推一致性与 Rollout 稳定性</w:t>
+              <w:t>Rollout 一致性验证（压缩保留）</w:t>
             </w:r>
           </w:p>
           <w:p>
@@ -715,7 +749,7 @@
                 <w:sz w:val="16"/>
                 <w:u w:val="none"/>
               </w:rPr>
-              <w:t>R3 Router Replay 与多卡可观测性：</w:t>
+              <w:t>R3 Router Replay：</w:t>
             </w:r>
             <w:r>
               <w:rPr>
@@ -724,134 +758,7 @@
                 <w:sz w:val="16"/>
                 <w:u w:val="none"/>
               </w:rPr>
-              <w:t>打通rollout路由采集、传输、训练侧回放与response-mask/mismatch/fτ²/KL闭环；8×H200、20-step对照中route mismatch由17%-19%降至0，fτ²/KL降低36-145×/4-7×，并扩展至128卡内部300B级模型的200-step监控运行。</w:t>
-            </w:r>
-          </w:p>
-          <w:p>
-            <w:pPr>
-              <w:keepLines w:val="0"/>
-              <w:spacing w:before="0" w:after="110" w:line="264" w:lineRule="auto"/>
-              <w:ind w:left="260" w:hanging="220"/>
-            </w:pPr>
-            <w:r>
-              <w:rPr>
-                <w:rFonts w:ascii="Times New Roman" w:hAnsi="Times New Roman" w:eastAsia="宋体"/>
-                <w:b w:val="0"/>
-                <w:sz w:val="16"/>
-                <w:u w:val="none"/>
-              </w:rPr>
-              <w:t xml:space="preserve">2. </w:t>
-            </w:r>
-            <w:r>
-              <w:rPr>
-                <w:rFonts w:ascii="Times New Roman" w:hAnsi="Times New Roman" w:eastAsia="宋体"/>
-                <w:b/>
-                <w:sz w:val="16"/>
-                <w:u w:val="none"/>
-              </w:rPr>
-              <w:t>FlashInfer CUDA Graph hang 排查与修复：</w:t>
-            </w:r>
-            <w:r>
-              <w:rPr>
-                <w:rFonts w:ascii="Times New Roman" w:hAnsi="Times New Roman" w:eastAsia="宋体"/>
-                <w:b w:val="0"/>
-                <w:sz w:val="16"/>
-                <w:u w:val="none"/>
-              </w:rPr>
-              <w:t>以H200两卡最小复现和TP/Graph/fused控制变量定位fused AllReduce + RMSNorm中Lamport -0.0 sentinel的FTZ误判；采用0x80000000位级判断修复后，模型级Graph on/off重复回归未再出现hang或timeout。</w:t>
-            </w:r>
-          </w:p>
-          <w:p>
-            <w:pPr>
-              <w:keepLines w:val="0"/>
-              <w:spacing w:before="0" w:after="50" w:line="264" w:lineRule="auto"/>
-              <w:ind w:left="140" w:hanging="140"/>
-            </w:pPr>
-            <w:r>
-              <w:rPr>
-                <w:rFonts w:ascii="Times New Roman" w:hAnsi="Times New Roman" w:eastAsia="宋体"/>
-                <w:b/>
-                <w:sz w:val="16"/>
-                <w:u w:val="none"/>
-              </w:rPr>
-              <w:t xml:space="preserve">• </w:t>
-            </w:r>
-            <w:r>
-              <w:rPr>
-                <w:rFonts w:ascii="Times New Roman" w:hAnsi="Times New Roman" w:eastAsia="宋体"/>
-                <w:b/>
-                <w:sz w:val="16"/>
-                <w:u w:val="none"/>
-              </w:rPr>
-              <w:t>训练算子优化经验</w:t>
-            </w:r>
-          </w:p>
-          <w:p>
-            <w:pPr>
-              <w:keepLines w:val="0"/>
-              <w:spacing w:before="0" w:after="110" w:line="264" w:lineRule="auto"/>
-              <w:ind w:left="260" w:hanging="220"/>
-            </w:pPr>
-            <w:r>
-              <w:rPr>
-                <w:rFonts w:ascii="Times New Roman" w:hAnsi="Times New Roman" w:eastAsia="宋体"/>
-                <w:b w:val="0"/>
-                <w:sz w:val="16"/>
-                <w:u w:val="none"/>
-              </w:rPr>
-              <w:t xml:space="preserve">1. </w:t>
-            </w:r>
-            <w:r>
-              <w:rPr>
-                <w:rFonts w:ascii="Times New Roman" w:hAnsi="Times New Roman" w:eastAsia="宋体"/>
-                <w:b/>
-                <w:sz w:val="16"/>
-                <w:u w:val="none"/>
-              </w:rPr>
-              <w:t>FA3 deterministic SWA backward：</w:t>
-            </w:r>
-            <w:r>
-              <w:rPr>
-                <w:rFonts w:ascii="Times New Roman" w:hAnsi="Times New Roman" w:eastAsia="宋体"/>
-                <w:b w:val="0"/>
-                <w:sz w:val="16"/>
-                <w:u w:val="none"/>
-              </w:rPr>
-              <w:t>定位dQ semaphore依赖链占确定性增量99.67%，在原fused kernel内完成contributor-relative ticket与reverse scheduler对齐；代表shape完整backward由6.755 ms降至1.699 ms（3.98×），3601/3601回归和1000次bitwise重复通过。</w:t>
-            </w:r>
-          </w:p>
-          <w:p>
-            <w:pPr>
-              <w:keepLines w:val="0"/>
-              <w:spacing w:before="0" w:after="110" w:line="264" w:lineRule="auto"/>
-              <w:ind w:left="260" w:hanging="220"/>
-            </w:pPr>
-            <w:r>
-              <w:rPr>
-                <w:rFonts w:ascii="Times New Roman" w:hAnsi="Times New Roman" w:eastAsia="宋体"/>
-                <w:b w:val="0"/>
-                <w:sz w:val="16"/>
-                <w:u w:val="none"/>
-              </w:rPr>
-              <w:t xml:space="preserve">2. </w:t>
-            </w:r>
-            <w:r>
-              <w:rPr>
-                <w:rFonts w:ascii="Times New Roman" w:hAnsi="Times New Roman" w:eastAsia="宋体"/>
-                <w:b/>
-                <w:sz w:val="16"/>
-                <w:u w:val="none"/>
-              </w:rPr>
-              <w:t>Sink FC1 GEMM 与通信竞争控核：</w:t>
-            </w:r>
-            <w:r>
-              <w:rPr>
-                <w:rFonts w:ascii="Times New Roman" w:hAnsi="Times New Roman" w:eastAsia="宋体"/>
-                <w:b w:val="0"/>
-                <w:sz w:val="16"/>
-                <w:u w:val="none"/>
-              </w:rPr>
-              <w:t>在4×H200双stream代理中以NCCL CTA预算与DeepGEMM SM budget控核，完成121组粗扫和89组细扫；AllGatherV联合span降低12.80%，其中控核独立贡献7.58%。</w:t>
+              <w:t>为验证rollout推理与训练侧路由对齐，完成route采集、response-mask对齐、训练回放及mismatch/fτ²/KL闭环；8×H200、20-step中route mismatch由17%-19%降至0，并扩展至128卡内部300B级模型的单轮200-step观测。</w:t>
             </w:r>
           </w:p>
           <w:p>
@@ -901,7 +808,7 @@
                 <w:sz w:val="16"/>
                 <w:u w:val="none"/>
               </w:rPr>
-              <w:t>TensorFlow MUSA Extension 算子、图优化与稳定性：</w:t>
+              <w:t>TensorFlow MUSA Extension（压缩保留）：</w:t>
             </w:r>
             <w:r>
               <w:rPr>
@@ -910,7 +817,7 @@
                 <w:sz w:val="16"/>
                 <w:u w:val="none"/>
               </w:rPr>
-              <w:t>负责muDNN GELU接入、GELU fusion链路修复、benchmark和热点算子优化，推动整网11个GELU全部融合，真实shape耗时降低36.6%；独立定位shape tensor误入device path并重构HostMemory，使inference 500轮成功率约30%提升至1000轮100%，4万/40万/80万轮长跑稳定；Logical_Or由21.2 μs降至10.7 μs，整网吞吐8187.48提升至8284.65。</w:t>
+              <w:t>完成GELU fusion、图优化与稳定性修复，推动整网11个GELU全部融合、真实shape耗时降低36.6%；修正shape tensor HostMemory路径后，1000轮inference成功率达100%。</w:t>
             </w:r>
           </w:p>
         </w:tc>
@@ -1373,7 +1280,7 @@
                 <w:sz w:val="17"/>
                 <w:u w:val="none"/>
               </w:rPr>
-              <w:t>H200 量化 Runtime 部署与TP2扩展：</w:t>
+              <w:t>H200 量化 Runtime 部署与 TP2 扩展：</w:t>
             </w:r>
             <w:r>
               <w:rPr>
@@ -1382,7 +1289,7 @@
                 <w:sz w:val="17"/>
                 <w:u w:val="none"/>
               </w:rPr>
-              <w:t>为在H200双卡交付32B量化模型推理，负责W4A16/W8A8/FP8后端适配、FlashAttention-2/4与GQA/softcap/SDPA链路接入，并以Compute Sanitizer定位gemv_kernel_g128尾组越界、补充边界保护；进一步实现Qwen2 packed-AWQ TP=2列/行切分与NCCL all-reduce。代表shape四类Sanitizer检查均为0 error/0 hazard；Qwen2.5-Coder-32B W4A16使checkpoint/峰值显存降低70.5%/66.8%，端到端输出吞吐提升76.8%。</w:t>
+              <w:t>为在双H200交付32B量化模型推理，负责W4A16/W8A8/FP8后端、FlashAttention-2/4与GQA/softcap/SDPA链路适配；以Compute Sanitizer定位gemv_kernel_g128尾组越界并补齐边界保护，继而实现Qwen2 packed-AWQ TP=2的Q/K/V、gate/up列切分及O/down行切分与NCCL all-reduce。代表shape四类Sanitizer均0 error/0 hazard；32B W4A16使checkpoint/峰值显存降低70.5%/66.8%，端到端输出吞吐提升76.8%。</w:t>
             </w:r>
           </w:p>
         </w:tc>
@@ -1518,7 +1425,7 @@
                 <w:sz w:val="17"/>
                 <w:u w:val="none"/>
               </w:rPr>
-              <w:t>关键Token加权 CoT 蒸馏：</w:t>
+              <w:t>关键Token加权 CoT 蒸馏（压缩保留）：</w:t>
             </w:r>
             <w:r>
               <w:rPr>
@@ -1527,7 +1434,7 @@
                 <w:sz w:val="17"/>
                 <w:u w:val="none"/>
               </w:rPr>
-              <w:t>负责训练、超参调优与vLLM TP=4评测，以教师推理token扰动后的参考答案似然下降量估计重要性，并用于加权SFT与辅助损失；Qwen2.5-7B-Instruct在GSM8K/SVAMP达到94.01%/94.00%，较最强基线提升5.51/10.10个百分点。</w:t>
+              <w:t>负责训练、调优与vLLM TP=4评测；Qwen2.5-7B-Instruct在GSM8K/SVAMP达到94.01%/94.00%，较最强基线提升5.51/10.10个百分点。</w:t>
             </w:r>
           </w:p>
         </w:tc>

</xml_diff>

<commit_message>
polish focused resume layout
</commit_message>
<xml_diff>
--- a/doc/冯浩然_AIInfra中文简历_推理优化版.docx
+++ b/doc/冯浩然_AIInfra中文简历_推理优化版.docx
@@ -597,7 +597,7 @@
                 <w:sz w:val="16"/>
                 <w:u w:val="none"/>
               </w:rPr>
-              <w:t>推理算子与执行路径优化（主体）</w:t>
+              <w:t>推理算子与执行路径优化</w:t>
             </w:r>
           </w:p>
           <w:p>
@@ -724,7 +724,7 @@
                 <w:sz w:val="16"/>
                 <w:u w:val="none"/>
               </w:rPr>
-              <w:t>Rollout 一致性验证（压缩保留）</w:t>
+              <w:t>Rollout 一致性验证</w:t>
             </w:r>
           </w:p>
           <w:p>
@@ -808,7 +808,7 @@
                 <w:sz w:val="16"/>
                 <w:u w:val="none"/>
               </w:rPr>
-              <w:t>TensorFlow MUSA Extension（压缩保留）：</w:t>
+              <w:t>TensorFlow MUSA Extension 算子与编译器优化：</w:t>
             </w:r>
             <w:r>
               <w:rPr>
@@ -817,7 +817,7 @@
                 <w:sz w:val="16"/>
                 <w:u w:val="none"/>
               </w:rPr>
-              <w:t>完成GELU fusion、图优化与稳定性修复，推动整网11个GELU全部融合、真实shape耗时降低36.6%；修正shape tensor HostMemory路径后，1000轮inference成功率达100%。</w:t>
+              <w:t>负责TensorFlow on MUSA的算子支持、图优化与稳定性治理：完成muDNN GELU接入、GELU fusion链路修复及benchmark，推动整网11个GELU全部融合、真实shape耗时降低36.6%；独立定位StridedSlice&lt;int32&gt;/Pack&lt;int32&gt;的shape tensor误入device path根因并重构HostMemory路径，使inference 500轮成功率约30%提升至1000轮100%，4万/40万/80万轮长跑稳定；优化Logical_Or scalar broadcast将21.2 μs降至10.7 μs，整网吞吐由8187.48提升至8284.65。</w:t>
             </w:r>
           </w:p>
         </w:tc>
@@ -1425,7 +1425,7 @@
                 <w:sz w:val="17"/>
                 <w:u w:val="none"/>
               </w:rPr>
-              <w:t>关键Token加权 CoT 蒸馏（压缩保留）：</w:t>
+              <w:t>关键Token加权 CoT 蒸馏：</w:t>
             </w:r>
             <w:r>
               <w:rPr>

</xml_diff>

<commit_message>
expand MUSA experience with STAR bullets
</commit_message>
<xml_diff>
--- a/doc/冯浩然_AIInfra中文简历_推理优化版.docx
+++ b/doc/冯浩然_AIInfra中文简历_推理优化版.docx
@@ -808,7 +808,7 @@
                 <w:sz w:val="16"/>
                 <w:u w:val="none"/>
               </w:rPr>
-              <w:t>TensorFlow MUSA Extension 算子与编译器优化：</w:t>
+              <w:t>GELU 融合与图优化：</w:t>
             </w:r>
             <w:r>
               <w:rPr>
@@ -817,7 +817,41 @@
                 <w:sz w:val="16"/>
                 <w:u w:val="none"/>
               </w:rPr>
-              <w:t>负责TensorFlow on MUSA的算子支持、图优化与稳定性治理：完成muDNN GELU接入、GELU fusion链路修复及benchmark，推动整网11个GELU全部融合、真实shape耗时降低36.6%；独立定位StridedSlice&lt;int32&gt;/Pack&lt;int32&gt;的shape tensor误入device path根因并重构HostMemory路径，使inference 500轮成功率约30%提升至1000轮100%，4万/40万/80万轮长跑稳定；优化Logical_Or scalar broadcast将21.2 μs降至10.7 μs，整网吞吐由8187.48提升至8284.65。</w:t>
+              <w:t>针对大图场景中部分GELU未被融合、整网图优化收益受限的问题，负责muDNN GELU接入、fusion链路修复与benchmark建设；补齐融合条件和回归验证后，推动整网11个GELU全部融合，真实shape耗时降低36.6%。</w:t>
+            </w:r>
+          </w:p>
+          <w:p>
+            <w:pPr>
+              <w:keepLines w:val="0"/>
+              <w:spacing w:before="0" w:after="110" w:line="264" w:lineRule="auto"/>
+              <w:ind w:left="140" w:hanging="140"/>
+            </w:pPr>
+            <w:r>
+              <w:rPr>
+                <w:rFonts w:ascii="Times New Roman" w:hAnsi="Times New Roman" w:eastAsia="宋体"/>
+                <w:b w:val="0"/>
+                <w:sz w:val="16"/>
+                <w:u w:val="none"/>
+              </w:rPr>
+              <w:t xml:space="preserve">• </w:t>
+            </w:r>
+            <w:r>
+              <w:rPr>
+                <w:rFonts w:ascii="Times New Roman" w:hAnsi="Times New Roman" w:eastAsia="宋体"/>
+                <w:b/>
+                <w:sz w:val="16"/>
+                <w:u w:val="none"/>
+              </w:rPr>
+              <w:t>整网稳定性与热点算子优化：</w:t>
+            </w:r>
+            <w:r>
+              <w:rPr>
+                <w:rFonts w:ascii="Times New Roman" w:hAnsi="Times New Roman" w:eastAsia="宋体"/>
+                <w:b w:val="0"/>
+                <w:sz w:val="16"/>
+                <w:u w:val="none"/>
+              </w:rPr>
+              <w:t>针对长跑OOM/随机崩溃及Logical_Or热点，定位StridedSlice&lt;int32&gt;/Pack&lt;int32&gt;将shape tensor误送device path的根因并重构HostMemory路径，使inference 500轮成功率由约30%提升至1000轮100%，4万/40万/80万轮长跑稳定；同时优化Logical_Or scalar broadcast并补齐Logical_And测试，平均耗时由21.2 μs降至10.7 μs，整网吞吐由8187.48提升至8284.65。</w:t>
             </w:r>
           </w:p>
         </w:tc>

</xml_diff>